<commit_message>
CONSAÚDE: briefing do roadshow sem rótulos de classificação
Remove as marcações de classificação ("depende de fato", "irregular")
dos pontos identificados, mantendo o conteúdo e a base legal.

Co-Authored-By: Claude Opus 5.5 <noreply@anthropic.com>
Claude-Session: https://claude.ai/code/session_01TrfDHY9D3MKaQfyrVNihp9
</commit_message>
<xml_diff>
--- a/concessoes/consaude-conc-2026/output/briefing-roadshow-2026-10-09.docx
+++ b/concessoes/consaude-conc-2026/output/briefing-roadshow-2026-10-09.docx
@@ -1305,7 +1305,7 @@
         <w:rPr>
           <w:rFonts w:ascii="Times New Roman" w:hAnsi="Times New Roman" w:cs="Times New Roman" w:eastAsia="Times New Roman"/>
         </w:rPr>
-        <w:t xml:space="preserve">Pontos identificados (classificação preliminar, sem juízo de força):</w:t>
+        <w:t xml:space="preserve">Pontos identificados:</w:t>
       </w:r>
     </w:p>
     <w:p>
@@ -1329,7 +1329,7 @@
         <w:rPr>
           <w:rFonts w:ascii="Times New Roman" w:hAnsi="Times New Roman" w:cs="Times New Roman" w:eastAsia="Times New Roman"/>
         </w:rPr>
-        <w:t xml:space="preserve"> Não se diz se conta o ano 1 ou o 30, nem se é só lixo domiciliar ou também o público. DEPENDE DE FATO (art. 67, §§ 1.º e 2.º, da Lei n.º 14.133/2021).</w:t>
+        <w:t xml:space="preserve"> Não se diz se conta o ano 1 ou o 30, nem se é só lixo domiciliar ou também o público (art. 67, §§ 1.º e 2.º, da Lei n.º 14.133/2021).</w:t>
       </w:r>
     </w:p>
     <w:p>
@@ -1353,7 +1353,7 @@
         <w:rPr>
           <w:rFonts w:ascii="Times New Roman" w:hAnsi="Times New Roman" w:cs="Times New Roman" w:eastAsia="Times New Roman"/>
         </w:rPr>
-        <w:t xml:space="preserve"> contra "períodos sucessivos ou não" da lei. IRREGULAR, a confirmar (art. 67, § 5.º).</w:t>
+        <w:t xml:space="preserve"> contra "períodos sucessivos ou não" da lei (art. 67, § 5.º).</w:t>
       </w:r>
     </w:p>
     <w:p>
@@ -1377,7 +1377,7 @@
         <w:rPr>
           <w:rFonts w:ascii="Times New Roman" w:hAnsi="Times New Roman" w:cs="Times New Roman" w:eastAsia="Times New Roman"/>
         </w:rPr>
-        <w:t xml:space="preserve"> com regras contraditórias: "aqui licitante" (6.2) contra "naquele consórcio" (15.3.1). IRREGULAR (art. 67, § 10).</w:t>
+        <w:t xml:space="preserve"> com regras contraditórias: o item 6.2 fala em "aqui licitante" e o 15.3.1 em "naquele consórcio" (art. 67, § 10).</w:t>
       </w:r>
     </w:p>
     <w:p>
@@ -1401,7 +1401,7 @@
         <w:rPr>
           <w:rFonts w:ascii="Times New Roman" w:hAnsi="Times New Roman" w:cs="Times New Roman" w:eastAsia="Times New Roman"/>
         </w:rPr>
-        <w:t xml:space="preserve"> não prevista. DEPENDE DE FATO (art. 15, III).</w:t>
+        <w:t xml:space="preserve"> não prevista (art. 15, III).</w:t>
       </w:r>
     </w:p>
     <w:p>
@@ -1425,7 +1425,7 @@
         <w:rPr>
           <w:rFonts w:ascii="Times New Roman" w:hAnsi="Times New Roman" w:cs="Times New Roman" w:eastAsia="Times New Roman"/>
         </w:rPr>
-        <w:t xml:space="preserve"> vale até para a experiência em investimento, sem o limite de 25% do objeto. IRREGULAR, a confirmar (art. 67, § 9.º).</w:t>
+        <w:t xml:space="preserve"> vale até para a experiência em investimento, sem o limite de 25% do objeto (art. 67, § 9.º).</w:t>
       </w:r>
     </w:p>
     <w:p>
@@ -1723,7 +1723,7 @@
         <w:rPr>
           <w:rFonts w:ascii="Times New Roman" w:hAnsi="Times New Roman" w:cs="Times New Roman" w:eastAsia="Times New Roman"/>
         </w:rPr>
-        <w:t xml:space="preserve">Pontos identificados (preliminares, sem juízo de força):</w:t>
+        <w:t xml:space="preserve">Pontos identificados:</w:t>
       </w:r>
     </w:p>
     <w:p>
@@ -1747,7 +1747,7 @@
         <w:rPr>
           <w:rFonts w:ascii="Times New Roman" w:hAnsi="Times New Roman" w:cs="Times New Roman" w:eastAsia="Times New Roman"/>
         </w:rPr>
-        <w:t xml:space="preserve"> 48 meses no Caderno contra biometanização nos anos 10 e 14 no Plano. IRREGULAR.</w:t>
+        <w:t xml:space="preserve"> 48 meses no Caderno contra biometanização nos anos 10 e 14 no Plano.</w:t>
       </w:r>
     </w:p>
     <w:p>
@@ -1771,7 +1771,7 @@
         <w:rPr>
           <w:rFonts w:ascii="Times New Roman" w:hAnsi="Times New Roman" w:cs="Times New Roman" w:eastAsia="Times New Roman"/>
         </w:rPr>
-        <w:t xml:space="preserve"> prevista na premissa (Plano, 4.3), mas zero no fluxo de caixa. IRREGULAR.</w:t>
+        <w:t xml:space="preserve"> prevista na premissa (Plano, 4.3), mas zero no fluxo de caixa.</w:t>
       </w:r>
     </w:p>
     <w:p>
@@ -1795,7 +1795,7 @@
         <w:rPr>
           <w:rFonts w:ascii="Times New Roman" w:hAnsi="Times New Roman" w:cs="Times New Roman" w:eastAsia="Times New Roman"/>
         </w:rPr>
-        <w:t xml:space="preserve">, embora o contrato exija aderência. DEPENDE DE FATO.</w:t>
+        <w:t xml:space="preserve">, embora o contrato exija aderência.</w:t>
       </w:r>
     </w:p>
     <w:p>
@@ -1819,7 +1819,7 @@
         <w:rPr>
           <w:rFonts w:ascii="Times New Roman" w:hAnsi="Times New Roman" w:cs="Times New Roman" w:eastAsia="Times New Roman"/>
         </w:rPr>
-        <w:t xml:space="preserve"> (ano de contrato e ano do calendário). DEPENDE DE FATO.</w:t>
+        <w:t xml:space="preserve"> (ano de contrato e ano do calendário).</w:t>
       </w:r>
     </w:p>
     <w:p>
@@ -1843,7 +1843,7 @@
         <w:rPr>
           <w:rFonts w:ascii="Times New Roman" w:hAnsi="Times New Roman" w:cs="Times New Roman" w:eastAsia="Times New Roman"/>
         </w:rPr>
-        <w:t xml:space="preserve"> o anexo ambiental não tem diretriz para coprocessamento, e a resolução CONAMA aplicável está a confirmar. DEPENDE DE FATO </w:t>
+        <w:t xml:space="preserve"> o anexo ambiental não tem diretriz para coprocessamento, e a resolução CONAMA aplicável está a confirmar </w:t>
       </w:r>
       <w:r>
         <w:rPr>
@@ -1993,447 +1993,133 @@
         <w:t xml:space="preserve">.</w:t>
       </w:r>
     </w:p>
-    <w:tbl>
-      <w:tblPr>
-        <w:tblStyle w:val="TableGrid"/>
-        <w:tblW w:w="0" w:type="auto"/>
-        <w:tblLayout w:type="fixed"/>
-        <w:tblLook w:val="04A0" w:firstRow="1" w:lastRow="0" w:firstColumn="0" w:lastColumn="0" w:noHBand="0" w:noVBand="1"/>
-        <w:tblBorders>
-          <w:top w:val="single" w:sz="4" w:space="0" w:color="808080"/>
-          <w:left w:val="single" w:sz="4" w:space="0" w:color="808080"/>
-          <w:bottom w:val="single" w:sz="4" w:space="0" w:color="808080"/>
-          <w:right w:val="single" w:sz="4" w:space="0" w:color="808080"/>
-          <w:insideH w:val="single" w:sz="4" w:space="0" w:color="808080"/>
-          <w:insideV w:val="single" w:sz="4" w:space="0" w:color="808080"/>
-        </w:tblBorders>
-      </w:tblPr>
-      <w:tblGrid>
-        <w:gridCol w:w="3120"/>
-        <w:gridCol w:w="3120"/>
-        <w:gridCol w:w="3120"/>
-      </w:tblGrid>
-      <w:tr>
-        <w:trPr>
-          <w:tblHeader/>
-          <w:cantSplit/>
-        </w:trPr>
-        <w:tc>
-          <w:tcPr>
-            <w:tcW w:w="3120" w:type="dxa"/>
-            <w:shd w:val="clear" w:color="auto" w:fill="D9D9D9"/>
-          </w:tcPr>
-          <w:p>
-            <w:pPr>
-              <w:spacing w:line="240" w:lineRule="auto" w:after="40"/>
-              <w:jc w:val="left"/>
-            </w:pPr>
-            <w:r>
-              <w:rPr>
-                <w:rFonts w:ascii="Times New Roman" w:hAnsi="Times New Roman" w:cs="Times New Roman" w:eastAsia="Times New Roman"/>
-                <w:b/>
-                <w:sz w:val="22"/>
-              </w:rPr>
-              <w:t xml:space="preserve">#</w:t>
-            </w:r>
-          </w:p>
-        </w:tc>
-        <w:tc>
-          <w:tcPr>
-            <w:tcW w:w="3120" w:type="dxa"/>
-            <w:shd w:val="clear" w:color="auto" w:fill="D9D9D9"/>
-          </w:tcPr>
-          <w:p>
-            <w:pPr>
-              <w:spacing w:line="240" w:lineRule="auto" w:after="40"/>
-              <w:jc w:val="left"/>
-            </w:pPr>
-            <w:r>
-              <w:rPr>
-                <w:rFonts w:ascii="Times New Roman" w:hAnsi="Times New Roman" w:cs="Times New Roman" w:eastAsia="Times New Roman"/>
-                <w:b/>
-                <w:sz w:val="22"/>
-              </w:rPr>
-              <w:t xml:space="preserve">Ponto</w:t>
-            </w:r>
-          </w:p>
-        </w:tc>
-        <w:tc>
-          <w:tcPr>
-            <w:tcW w:w="3120" w:type="dxa"/>
-            <w:shd w:val="clear" w:color="auto" w:fill="D9D9D9"/>
-          </w:tcPr>
-          <w:p>
-            <w:pPr>
-              <w:spacing w:line="240" w:lineRule="auto" w:after="40"/>
-              <w:jc w:val="left"/>
-            </w:pPr>
-            <w:r>
-              <w:rPr>
-                <w:rFonts w:ascii="Times New Roman" w:hAnsi="Times New Roman" w:cs="Times New Roman" w:eastAsia="Times New Roman"/>
-                <w:b/>
-                <w:sz w:val="22"/>
-              </w:rPr>
-              <w:t xml:space="preserve">Classificação</w:t>
-            </w:r>
-          </w:p>
-        </w:tc>
-      </w:tr>
-      <w:tr>
-        <w:trPr>
-          <w:cantSplit/>
-        </w:trPr>
-        <w:tc>
-          <w:tcPr>
-            <w:tcW w:w="3120" w:type="dxa"/>
-          </w:tcPr>
-          <w:p>
-            <w:pPr>
-              <w:spacing w:line="240" w:lineRule="auto" w:after="40"/>
-              <w:jc w:val="left"/>
-            </w:pPr>
-            <w:r>
-              <w:rPr>
-                <w:rFonts w:ascii="Times New Roman" w:hAnsi="Times New Roman" w:cs="Times New Roman" w:eastAsia="Times New Roman"/>
-                <w:sz w:val="22"/>
-              </w:rPr>
-              <w:t xml:space="preserve">1</w:t>
-            </w:r>
-          </w:p>
-        </w:tc>
-        <w:tc>
-          <w:tcPr>
-            <w:tcW w:w="3120" w:type="dxa"/>
-          </w:tcPr>
-          <w:p>
-            <w:pPr>
-              <w:spacing w:line="240" w:lineRule="auto" w:after="40"/>
-              <w:jc w:val="left"/>
-            </w:pPr>
-            <w:r>
-              <w:rPr>
-                <w:rFonts w:ascii="Times New Roman" w:hAnsi="Times New Roman" w:cs="Times New Roman" w:eastAsia="Times New Roman"/>
-                <w:sz w:val="22"/>
-              </w:rPr>
-              <w:t xml:space="preserve">Os dados de consumo por 30 anos são obrigação do CONSAÚDE (Contrato, 13, XV, ii), mas a SABESP não está vinculada a nenhum instrumento nos autos</w:t>
-            </w:r>
-          </w:p>
-        </w:tc>
-        <w:tc>
-          <w:tcPr>
-            <w:tcW w:w="3120" w:type="dxa"/>
-          </w:tcPr>
-          <w:p>
-            <w:pPr>
-              <w:spacing w:line="240" w:lineRule="auto" w:after="40"/>
-              <w:jc w:val="left"/>
-            </w:pPr>
-            <w:r>
-              <w:rPr>
-                <w:rFonts w:ascii="Times New Roman" w:hAnsi="Times New Roman" w:cs="Times New Roman" w:eastAsia="Times New Roman"/>
-                <w:sz w:val="22"/>
-              </w:rPr>
-              <w:t xml:space="preserve">DEPENDE DE FATO</w:t>
-            </w:r>
-          </w:p>
-        </w:tc>
-      </w:tr>
-      <w:tr>
-        <w:trPr>
-          <w:cantSplit/>
-        </w:trPr>
-        <w:tc>
-          <w:tcPr>
-            <w:tcW w:w="3120" w:type="dxa"/>
-          </w:tcPr>
-          <w:p>
-            <w:pPr>
-              <w:spacing w:line="240" w:lineRule="auto" w:after="40"/>
-              <w:jc w:val="left"/>
-            </w:pPr>
-            <w:r>
-              <w:rPr>
-                <w:rFonts w:ascii="Times New Roman" w:hAnsi="Times New Roman" w:cs="Times New Roman" w:eastAsia="Times New Roman"/>
-                <w:sz w:val="22"/>
-              </w:rPr>
-              <w:t xml:space="preserve">2</w:t>
-            </w:r>
-          </w:p>
-        </w:tc>
-        <w:tc>
-          <w:tcPr>
-            <w:tcW w:w="3120" w:type="dxa"/>
-          </w:tcPr>
-          <w:p>
-            <w:pPr>
-              <w:spacing w:line="240" w:lineRule="auto" w:after="40"/>
-              <w:jc w:val="left"/>
-            </w:pPr>
-            <w:r>
-              <w:rPr>
-                <w:rFonts w:ascii="Times New Roman" w:hAnsi="Times New Roman" w:cs="Times New Roman" w:eastAsia="Times New Roman"/>
-                <w:sz w:val="22"/>
-              </w:rPr>
-              <w:t xml:space="preserve">Pela matriz, só o cadastro inicial é risco público (item 36). Risco não listado é da concessionária (Edital, 28.2.3)</w:t>
-            </w:r>
-          </w:p>
-        </w:tc>
-        <w:tc>
-          <w:tcPr>
-            <w:tcW w:w="3120" w:type="dxa"/>
-          </w:tcPr>
-          <w:p>
-            <w:pPr>
-              <w:spacing w:line="240" w:lineRule="auto" w:after="40"/>
-              <w:jc w:val="left"/>
-            </w:pPr>
-            <w:r>
-              <w:rPr>
-                <w:rFonts w:ascii="Times New Roman" w:hAnsi="Times New Roman" w:cs="Times New Roman" w:eastAsia="Times New Roman"/>
-                <w:sz w:val="22"/>
-              </w:rPr>
-              <w:t xml:space="preserve">IRREGULAR (contradição entre obrigação e risco)</w:t>
-            </w:r>
-          </w:p>
-        </w:tc>
-      </w:tr>
-      <w:tr>
-        <w:trPr>
-          <w:cantSplit/>
-        </w:trPr>
-        <w:tc>
-          <w:tcPr>
-            <w:tcW w:w="3120" w:type="dxa"/>
-          </w:tcPr>
-          <w:p>
-            <w:pPr>
-              <w:spacing w:line="240" w:lineRule="auto" w:after="40"/>
-              <w:jc w:val="left"/>
-            </w:pPr>
-            <w:r>
-              <w:rPr>
-                <w:rFonts w:ascii="Times New Roman" w:hAnsi="Times New Roman" w:cs="Times New Roman" w:eastAsia="Times New Roman"/>
-                <w:sz w:val="22"/>
-              </w:rPr>
-              <w:t xml:space="preserve">3</w:t>
-            </w:r>
-          </w:p>
-        </w:tc>
-        <w:tc>
-          <w:tcPr>
-            <w:tcW w:w="3120" w:type="dxa"/>
-          </w:tcPr>
-          <w:p>
-            <w:pPr>
-              <w:spacing w:line="240" w:lineRule="auto" w:after="40"/>
-              <w:jc w:val="left"/>
-            </w:pPr>
-            <w:r>
-              <w:rPr>
-                <w:rFonts w:ascii="Times New Roman" w:hAnsi="Times New Roman" w:cs="Times New Roman" w:eastAsia="Times New Roman"/>
-                <w:sz w:val="22"/>
-              </w:rPr>
-              <w:t xml:space="preserve">A tarifa social não tem critério, e o contrato remete aos subitens 7.2.2, 7.2.5 e 7.2.6, que não existem</w:t>
-            </w:r>
-          </w:p>
-        </w:tc>
-        <w:tc>
-          <w:tcPr>
-            <w:tcW w:w="3120" w:type="dxa"/>
-          </w:tcPr>
-          <w:p>
-            <w:pPr>
-              <w:spacing w:line="240" w:lineRule="auto" w:after="40"/>
-              <w:jc w:val="left"/>
-            </w:pPr>
-            <w:r>
-              <w:rPr>
-                <w:rFonts w:ascii="Times New Roman" w:hAnsi="Times New Roman" w:cs="Times New Roman" w:eastAsia="Times New Roman"/>
-                <w:sz w:val="22"/>
-              </w:rPr>
-              <w:t xml:space="preserve">IRREGULAR (omissão e erro material)</w:t>
-            </w:r>
-          </w:p>
-        </w:tc>
-      </w:tr>
-      <w:tr>
-        <w:trPr>
-          <w:cantSplit/>
-        </w:trPr>
-        <w:tc>
-          <w:tcPr>
-            <w:tcW w:w="3120" w:type="dxa"/>
-          </w:tcPr>
-          <w:p>
-            <w:pPr>
-              <w:spacing w:line="240" w:lineRule="auto" w:after="40"/>
-              <w:jc w:val="left"/>
-            </w:pPr>
-            <w:r>
-              <w:rPr>
-                <w:rFonts w:ascii="Times New Roman" w:hAnsi="Times New Roman" w:cs="Times New Roman" w:eastAsia="Times New Roman"/>
-                <w:sz w:val="22"/>
-              </w:rPr>
-              <w:t xml:space="preserve">4</w:t>
-            </w:r>
-          </w:p>
-        </w:tc>
-        <w:tc>
-          <w:tcPr>
-            <w:tcW w:w="3120" w:type="dxa"/>
-          </w:tcPr>
-          <w:p>
-            <w:pPr>
-              <w:spacing w:line="240" w:lineRule="auto" w:after="40"/>
-              <w:jc w:val="left"/>
-            </w:pPr>
-            <w:r>
-              <w:rPr>
-                <w:rFonts w:ascii="Times New Roman" w:hAnsi="Times New Roman" w:cs="Times New Roman" w:eastAsia="Times New Roman"/>
-                <w:sz w:val="22"/>
-              </w:rPr>
-              <w:t xml:space="preserve">Periodicidade do coeficiente de geração: anual no Anexo 6; no ano 2 e depois a cada 5 anos no contrato</w:t>
-            </w:r>
-          </w:p>
-        </w:tc>
-        <w:tc>
-          <w:tcPr>
-            <w:tcW w:w="3120" w:type="dxa"/>
-          </w:tcPr>
-          <w:p>
-            <w:pPr>
-              <w:spacing w:line="240" w:lineRule="auto" w:after="40"/>
-              <w:jc w:val="left"/>
-            </w:pPr>
-            <w:r>
-              <w:rPr>
-                <w:rFonts w:ascii="Times New Roman" w:hAnsi="Times New Roman" w:cs="Times New Roman" w:eastAsia="Times New Roman"/>
-                <w:sz w:val="22"/>
-              </w:rPr>
-              <w:t xml:space="preserve">IRREGULAR (contradição)</w:t>
-            </w:r>
-          </w:p>
-        </w:tc>
-      </w:tr>
-      <w:tr>
-        <w:trPr>
-          <w:cantSplit/>
-        </w:trPr>
-        <w:tc>
-          <w:tcPr>
-            <w:tcW w:w="3120" w:type="dxa"/>
-          </w:tcPr>
-          <w:p>
-            <w:pPr>
-              <w:spacing w:line="240" w:lineRule="auto" w:after="40"/>
-              <w:jc w:val="left"/>
-            </w:pPr>
-            <w:r>
-              <w:rPr>
-                <w:rFonts w:ascii="Times New Roman" w:hAnsi="Times New Roman" w:cs="Times New Roman" w:eastAsia="Times New Roman"/>
-                <w:sz w:val="22"/>
-              </w:rPr>
-              <w:t xml:space="preserve">5</w:t>
-            </w:r>
-          </w:p>
-        </w:tc>
-        <w:tc>
-          <w:tcPr>
-            <w:tcW w:w="3120" w:type="dxa"/>
-          </w:tcPr>
-          <w:p>
-            <w:pPr>
-              <w:spacing w:line="240" w:lineRule="auto" w:after="40"/>
-              <w:jc w:val="left"/>
-            </w:pPr>
-            <w:r>
-              <w:rPr>
-                <w:rFonts w:ascii="Times New Roman" w:hAnsi="Times New Roman" w:cs="Times New Roman" w:eastAsia="Times New Roman"/>
-                <w:sz w:val="22"/>
-              </w:rPr>
-              <w:t xml:space="preserve">O coeficiente de 3,3570 kg/m³ não fecha com os números publicados, que dão 4,82 kg/m³</w:t>
-            </w:r>
-          </w:p>
-        </w:tc>
-        <w:tc>
-          <w:tcPr>
-            <w:tcW w:w="3120" w:type="dxa"/>
-          </w:tcPr>
-          <w:p>
-            <w:pPr>
-              <w:spacing w:line="240" w:lineRule="auto" w:after="40"/>
-              <w:jc w:val="left"/>
-            </w:pPr>
-            <w:r>
-              <w:rPr>
-                <w:rFonts w:ascii="Times New Roman" w:hAnsi="Times New Roman" w:cs="Times New Roman" w:eastAsia="Times New Roman"/>
-                <w:sz w:val="22"/>
-              </w:rPr>
-              <w:t xml:space="preserve">DEPENDE DE FATO [VALIDAÇÃO TÉCNICA]</w:t>
-            </w:r>
-          </w:p>
-        </w:tc>
-      </w:tr>
-      <w:tr>
-        <w:trPr>
-          <w:cantSplit/>
-        </w:trPr>
-        <w:tc>
-          <w:tcPr>
-            <w:tcW w:w="3120" w:type="dxa"/>
-          </w:tcPr>
-          <w:p>
-            <w:pPr>
-              <w:spacing w:line="240" w:lineRule="auto" w:after="40"/>
-              <w:jc w:val="left"/>
-            </w:pPr>
-            <w:r>
-              <w:rPr>
-                <w:rFonts w:ascii="Times New Roman" w:hAnsi="Times New Roman" w:cs="Times New Roman" w:eastAsia="Times New Roman"/>
-                <w:sz w:val="22"/>
-              </w:rPr>
-              <w:t xml:space="preserve">6</w:t>
-            </w:r>
-          </w:p>
-        </w:tc>
-        <w:tc>
-          <w:tcPr>
-            <w:tcW w:w="3120" w:type="dxa"/>
-          </w:tcPr>
-          <w:p>
-            <w:pPr>
-              <w:spacing w:line="240" w:lineRule="auto" w:after="40"/>
-              <w:jc w:val="left"/>
-            </w:pPr>
-            <w:r>
-              <w:rPr>
-                <w:rFonts w:ascii="Times New Roman" w:hAnsi="Times New Roman" w:cs="Times New Roman" w:eastAsia="Times New Roman"/>
-                <w:sz w:val="22"/>
-              </w:rPr>
-              <w:t xml:space="preserve">Não há instrumento de compartilhamento de dados pessoais (art. 26, § 1.º, IV, da LGPD)</w:t>
-            </w:r>
-          </w:p>
-        </w:tc>
-        <w:tc>
-          <w:tcPr>
-            <w:tcW w:w="3120" w:type="dxa"/>
-          </w:tcPr>
-          <w:p>
-            <w:pPr>
-              <w:spacing w:line="240" w:lineRule="auto" w:after="40"/>
-              <w:jc w:val="left"/>
-            </w:pPr>
-            <w:r>
-              <w:rPr>
-                <w:rFonts w:ascii="Times New Roman" w:hAnsi="Times New Roman" w:cs="Times New Roman" w:eastAsia="Times New Roman"/>
-                <w:sz w:val="22"/>
-              </w:rPr>
-              <w:t xml:space="preserve">DEPENDE DE FATO</w:t>
-            </w:r>
-          </w:p>
-        </w:tc>
-      </w:tr>
-    </w:tbl>
+    <w:p>
+      <w:pPr>
+        <w:spacing w:line="360" w:lineRule="auto" w:after="120"/>
+        <w:jc w:val="both"/>
+      </w:pPr>
+      <w:r>
+        <w:rPr>
+          <w:rFonts w:ascii="Times New Roman" w:hAnsi="Times New Roman" w:cs="Times New Roman" w:eastAsia="Times New Roman"/>
+        </w:rPr>
+        <w:t xml:space="preserve">Pontos identificados:</w:t>
+      </w:r>
+    </w:p>
+    <w:p>
+      <w:pPr>
+        <w:pStyle w:val="ListParagraph"/>
+        <w:numPr>
+          <w:ilvl w:val="0"/>
+          <w:numId w:val="9"/>
+        </w:numPr>
+        <w:spacing w:line="360" w:lineRule="auto" w:after="120"/>
+        <w:jc w:val="both"/>
+      </w:pPr>
+      <w:r>
+        <w:rPr>
+          <w:rFonts w:ascii="Times New Roman" w:hAnsi="Times New Roman" w:cs="Times New Roman" w:eastAsia="Times New Roman"/>
+        </w:rPr>
+        <w:t xml:space="preserve">Os dados de consumo por 30 anos são obrigação do CONSAÚDE (Contrato, 13, XV, ii), mas a SABESP não está vinculada a nenhum instrumento nos autos.</w:t>
+      </w:r>
+    </w:p>
+    <w:p>
+      <w:pPr>
+        <w:pStyle w:val="ListParagraph"/>
+        <w:numPr>
+          <w:ilvl w:val="0"/>
+          <w:numId w:val="9"/>
+        </w:numPr>
+        <w:spacing w:line="360" w:lineRule="auto" w:after="120"/>
+        <w:jc w:val="both"/>
+      </w:pPr>
+      <w:r>
+        <w:rPr>
+          <w:rFonts w:ascii="Times New Roman" w:hAnsi="Times New Roman" w:cs="Times New Roman" w:eastAsia="Times New Roman"/>
+        </w:rPr>
+        <w:t xml:space="preserve">Pela matriz, só o cadastro inicial é risco público (item 36). Risco não listado é da concessionária (Edital, 28.2.3), mesmo sendo do CONSAÚDE a obrigação de fornecer os dados.</w:t>
+      </w:r>
+    </w:p>
+    <w:p>
+      <w:pPr>
+        <w:pStyle w:val="ListParagraph"/>
+        <w:numPr>
+          <w:ilvl w:val="0"/>
+          <w:numId w:val="9"/>
+        </w:numPr>
+        <w:spacing w:line="360" w:lineRule="auto" w:after="120"/>
+        <w:jc w:val="both"/>
+      </w:pPr>
+      <w:r>
+        <w:rPr>
+          <w:rFonts w:ascii="Times New Roman" w:hAnsi="Times New Roman" w:cs="Times New Roman" w:eastAsia="Times New Roman"/>
+        </w:rPr>
+        <w:t xml:space="preserve">A tarifa social não tem critério, e o contrato remete aos subitens 7.2.2, 7.2.5 e 7.2.6, que não existem.</w:t>
+      </w:r>
+    </w:p>
+    <w:p>
+      <w:pPr>
+        <w:pStyle w:val="ListParagraph"/>
+        <w:numPr>
+          <w:ilvl w:val="0"/>
+          <w:numId w:val="9"/>
+        </w:numPr>
+        <w:spacing w:line="360" w:lineRule="auto" w:after="120"/>
+        <w:jc w:val="both"/>
+      </w:pPr>
+      <w:r>
+        <w:rPr>
+          <w:rFonts w:ascii="Times New Roman" w:hAnsi="Times New Roman" w:cs="Times New Roman" w:eastAsia="Times New Roman"/>
+        </w:rPr>
+        <w:t xml:space="preserve">A periodicidade do coeficiente de geração se contradiz: anual no Anexo 6; no ano 2 e depois a cada 5 anos no contrato.</w:t>
+      </w:r>
+    </w:p>
+    <w:p>
+      <w:pPr>
+        <w:pStyle w:val="ListParagraph"/>
+        <w:numPr>
+          <w:ilvl w:val="0"/>
+          <w:numId w:val="9"/>
+        </w:numPr>
+        <w:spacing w:line="360" w:lineRule="auto" w:after="120"/>
+        <w:jc w:val="both"/>
+      </w:pPr>
+      <w:r>
+        <w:rPr>
+          <w:rFonts w:ascii="Times New Roman" w:hAnsi="Times New Roman" w:cs="Times New Roman" w:eastAsia="Times New Roman"/>
+        </w:rPr>
+        <w:t xml:space="preserve">O coeficiente de 3,3570 kg/m³ não fecha com os números publicados, que dão 4,82 kg/m³ </w:t>
+      </w:r>
+      <w:r>
+        <w:rPr>
+          <w:rFonts w:ascii="Times New Roman" w:hAnsi="Times New Roman" w:cs="Times New Roman" w:eastAsia="Times New Roman"/>
+          <w:b/>
+        </w:rPr>
+        <w:t xml:space="preserve">[VALIDAÇÃO TÉCNICA]</w:t>
+      </w:r>
+      <w:r>
+        <w:rPr>
+          <w:rFonts w:ascii="Times New Roman" w:hAnsi="Times New Roman" w:cs="Times New Roman" w:eastAsia="Times New Roman"/>
+        </w:rPr>
+        <w:t xml:space="preserve">.</w:t>
+      </w:r>
+    </w:p>
+    <w:p>
+      <w:pPr>
+        <w:pStyle w:val="ListParagraph"/>
+        <w:numPr>
+          <w:ilvl w:val="0"/>
+          <w:numId w:val="9"/>
+        </w:numPr>
+        <w:spacing w:line="360" w:lineRule="auto" w:after="120"/>
+        <w:jc w:val="both"/>
+      </w:pPr>
+      <w:r>
+        <w:rPr>
+          <w:rFonts w:ascii="Times New Roman" w:hAnsi="Times New Roman" w:cs="Times New Roman" w:eastAsia="Times New Roman"/>
+        </w:rPr>
+        <w:t xml:space="preserve">Não há instrumento de compartilhamento de dados pessoais (art. 26, § 1.º, IV, da LGPD).</w:t>
+      </w:r>
+    </w:p>
     <w:p>
       <w:pPr>
         <w:pStyle w:val="Heading2"/>
@@ -2477,7 +2163,7 @@
         <w:pStyle w:val="ListParagraph"/>
         <w:numPr>
           <w:ilvl w:val="0"/>
-          <w:numId w:val="9"/>
+          <w:numId w:val="10"/>
         </w:numPr>
         <w:spacing w:line="360" w:lineRule="auto" w:after="120"/>
         <w:jc w:val="both"/>
@@ -2494,7 +2180,7 @@
         <w:pStyle w:val="ListParagraph"/>
         <w:numPr>
           <w:ilvl w:val="0"/>
-          <w:numId w:val="9"/>
+          <w:numId w:val="10"/>
         </w:numPr>
         <w:spacing w:line="360" w:lineRule="auto" w:after="120"/>
         <w:jc w:val="both"/>
@@ -2511,7 +2197,7 @@
         <w:pStyle w:val="ListParagraph"/>
         <w:numPr>
           <w:ilvl w:val="0"/>
-          <w:numId w:val="9"/>
+          <w:numId w:val="10"/>
         </w:numPr>
         <w:spacing w:line="360" w:lineRule="auto" w:after="120"/>
         <w:jc w:val="both"/>
@@ -2528,7 +2214,7 @@
         <w:pStyle w:val="ListParagraph"/>
         <w:numPr>
           <w:ilvl w:val="0"/>
-          <w:numId w:val="9"/>
+          <w:numId w:val="10"/>
         </w:numPr>
         <w:spacing w:line="360" w:lineRule="auto" w:after="120"/>
         <w:jc w:val="both"/>
@@ -2545,7 +2231,7 @@
         <w:pStyle w:val="ListParagraph"/>
         <w:numPr>
           <w:ilvl w:val="0"/>
-          <w:numId w:val="9"/>
+          <w:numId w:val="10"/>
         </w:numPr>
         <w:spacing w:line="360" w:lineRule="auto" w:after="120"/>
         <w:jc w:val="both"/>
@@ -2562,7 +2248,7 @@
         <w:pStyle w:val="ListParagraph"/>
         <w:numPr>
           <w:ilvl w:val="0"/>
-          <w:numId w:val="9"/>
+          <w:numId w:val="10"/>
         </w:numPr>
         <w:spacing w:line="360" w:lineRule="auto" w:after="120"/>
         <w:jc w:val="both"/>
@@ -2592,7 +2278,7 @@
         <w:pStyle w:val="ListParagraph"/>
         <w:numPr>
           <w:ilvl w:val="0"/>
-          <w:numId w:val="10"/>
+          <w:numId w:val="11"/>
         </w:numPr>
         <w:spacing w:line="360" w:lineRule="auto" w:after="120"/>
         <w:jc w:val="both"/>
@@ -2609,7 +2295,7 @@
         <w:pStyle w:val="ListParagraph"/>
         <w:numPr>
           <w:ilvl w:val="0"/>
-          <w:numId w:val="10"/>
+          <w:numId w:val="11"/>
         </w:numPr>
         <w:spacing w:line="360" w:lineRule="auto" w:after="120"/>
         <w:jc w:val="both"/>
@@ -2626,7 +2312,7 @@
         <w:pStyle w:val="ListParagraph"/>
         <w:numPr>
           <w:ilvl w:val="0"/>
-          <w:numId w:val="10"/>
+          <w:numId w:val="11"/>
         </w:numPr>
         <w:spacing w:line="360" w:lineRule="auto" w:after="120"/>
         <w:jc w:val="both"/>
@@ -2643,7 +2329,7 @@
         <w:pStyle w:val="ListParagraph"/>
         <w:numPr>
           <w:ilvl w:val="0"/>
-          <w:numId w:val="10"/>
+          <w:numId w:val="11"/>
         </w:numPr>
         <w:spacing w:line="360" w:lineRule="auto" w:after="120"/>
         <w:jc w:val="both"/>
@@ -2660,7 +2346,7 @@
         <w:pStyle w:val="ListParagraph"/>
         <w:numPr>
           <w:ilvl w:val="0"/>
-          <w:numId w:val="10"/>
+          <w:numId w:val="11"/>
         </w:numPr>
         <w:spacing w:line="360" w:lineRule="auto" w:after="120"/>
         <w:jc w:val="both"/>
@@ -2690,7 +2376,7 @@
         <w:pStyle w:val="ListParagraph"/>
         <w:numPr>
           <w:ilvl w:val="0"/>
-          <w:numId w:val="11"/>
+          <w:numId w:val="12"/>
         </w:numPr>
         <w:spacing w:line="360" w:lineRule="auto" w:after="120"/>
         <w:jc w:val="both"/>
@@ -2707,7 +2393,7 @@
         <w:pStyle w:val="ListParagraph"/>
         <w:numPr>
           <w:ilvl w:val="0"/>
-          <w:numId w:val="11"/>
+          <w:numId w:val="12"/>
         </w:numPr>
         <w:spacing w:line="360" w:lineRule="auto" w:after="120"/>
         <w:jc w:val="both"/>
@@ -2724,7 +2410,7 @@
         <w:pStyle w:val="ListParagraph"/>
         <w:numPr>
           <w:ilvl w:val="0"/>
-          <w:numId w:val="11"/>
+          <w:numId w:val="12"/>
         </w:numPr>
         <w:spacing w:line="360" w:lineRule="auto" w:after="120"/>
         <w:jc w:val="both"/>
@@ -2741,7 +2427,7 @@
         <w:pStyle w:val="ListParagraph"/>
         <w:numPr>
           <w:ilvl w:val="0"/>
-          <w:numId w:val="11"/>
+          <w:numId w:val="12"/>
         </w:numPr>
         <w:spacing w:line="360" w:lineRule="auto" w:after="120"/>
         <w:jc w:val="both"/>
@@ -2758,7 +2444,7 @@
         <w:pStyle w:val="ListParagraph"/>
         <w:numPr>
           <w:ilvl w:val="0"/>
-          <w:numId w:val="11"/>
+          <w:numId w:val="12"/>
         </w:numPr>
         <w:spacing w:line="360" w:lineRule="auto" w:after="120"/>
         <w:jc w:val="both"/>
@@ -2775,7 +2461,7 @@
         <w:pStyle w:val="ListParagraph"/>
         <w:numPr>
           <w:ilvl w:val="0"/>
-          <w:numId w:val="11"/>
+          <w:numId w:val="12"/>
         </w:numPr>
         <w:spacing w:line="360" w:lineRule="auto" w:after="120"/>
         <w:jc w:val="both"/>
@@ -3508,7 +3194,7 @@
         <w:pStyle w:val="ListParagraph"/>
         <w:numPr>
           <w:ilvl w:val="0"/>
-          <w:numId w:val="12"/>
+          <w:numId w:val="13"/>
         </w:numPr>
         <w:spacing w:line="360" w:lineRule="auto" w:after="120"/>
         <w:jc w:val="both"/>
@@ -3525,7 +3211,7 @@
         <w:pStyle w:val="ListParagraph"/>
         <w:numPr>
           <w:ilvl w:val="0"/>
-          <w:numId w:val="12"/>
+          <w:numId w:val="13"/>
         </w:numPr>
         <w:spacing w:line="360" w:lineRule="auto" w:after="120"/>
         <w:jc w:val="both"/>
@@ -3542,7 +3228,7 @@
         <w:pStyle w:val="ListParagraph"/>
         <w:numPr>
           <w:ilvl w:val="0"/>
-          <w:numId w:val="12"/>
+          <w:numId w:val="13"/>
         </w:numPr>
         <w:spacing w:line="360" w:lineRule="auto" w:after="120"/>
         <w:jc w:val="both"/>
@@ -3559,7 +3245,7 @@
         <w:pStyle w:val="ListParagraph"/>
         <w:numPr>
           <w:ilvl w:val="0"/>
-          <w:numId w:val="12"/>
+          <w:numId w:val="13"/>
         </w:numPr>
         <w:spacing w:line="360" w:lineRule="auto" w:after="120"/>
         <w:jc w:val="both"/>
@@ -3576,7 +3262,7 @@
         <w:pStyle w:val="ListParagraph"/>
         <w:numPr>
           <w:ilvl w:val="0"/>
-          <w:numId w:val="12"/>
+          <w:numId w:val="13"/>
         </w:numPr>
         <w:spacing w:line="360" w:lineRule="auto" w:after="120"/>
         <w:jc w:val="both"/>
@@ -3593,7 +3279,7 @@
         <w:pStyle w:val="ListParagraph"/>
         <w:numPr>
           <w:ilvl w:val="0"/>
-          <w:numId w:val="12"/>
+          <w:numId w:val="13"/>
         </w:numPr>
         <w:spacing w:line="360" w:lineRule="auto" w:after="120"/>
         <w:jc w:val="both"/>
@@ -3610,7 +3296,7 @@
         <w:pStyle w:val="ListParagraph"/>
         <w:numPr>
           <w:ilvl w:val="0"/>
-          <w:numId w:val="12"/>
+          <w:numId w:val="13"/>
         </w:numPr>
         <w:spacing w:line="360" w:lineRule="auto" w:after="120"/>
         <w:jc w:val="both"/>
@@ -3872,16 +3558,22 @@
   <w:num w:numId="10">
     <w:abstractNumId w:val="1"/>
     <w:lvlOverride w:ilvl="0">
-      <w:startOverride w:val="7"/>
+      <w:startOverride w:val="1"/>
     </w:lvlOverride>
   </w:num>
   <w:num w:numId="11">
     <w:abstractNumId w:val="1"/>
     <w:lvlOverride w:ilvl="0">
+      <w:startOverride w:val="7"/>
+    </w:lvlOverride>
+  </w:num>
+  <w:num w:numId="12">
+    <w:abstractNumId w:val="1"/>
+    <w:lvlOverride w:ilvl="0">
       <w:startOverride w:val="12"/>
     </w:lvlOverride>
   </w:num>
-  <w:num w:numId="12">
+  <w:num w:numId="13">
     <w:abstractNumId w:val="0"/>
   </w:num>
 </w:numbering>

</xml_diff>

<commit_message>
CONSAÚDE: briefing — prazos do aterro no item 7 (rota tecnológica)
Detalha no item 7.1 a disposição final: prazo até a Ordem de Serviço,
regras do aterro próprio, ausência de prazo específico no cronograma do
Caderno, rota de referência e condições ao fim do contrato.

Co-Authored-By: Claude Opus 5.5 <noreply@anthropic.com>
Claude-Session: https://claude.ai/code/session_01TrfDHY9D3MKaQfyrVNihp9
</commit_message>
<xml_diff>
--- a/concessoes/consaude-conc-2026/output/briefing-roadshow-2026-10-09.docx
+++ b/concessoes/consaude-conc-2026/output/briefing-roadshow-2026-10-09.docx
@@ -100,6 +100,7 @@
           </w:tcPr>
           <w:p>
             <w:pPr>
+              <w:keepNext/>
               <w:spacing w:line="240"/>
             </w:pPr>
             <w:r>
@@ -133,6 +134,7 @@
           </w:tcPr>
           <w:p>
             <w:pPr>
+              <w:keepNext/>
               <w:spacing w:line="240"/>
             </w:pPr>
             <w:r>
@@ -171,6 +173,7 @@
           </w:tcPr>
           <w:p>
             <w:pPr>
+              <w:keepNext/>
               <w:spacing w:line="240"/>
             </w:pPr>
             <w:r>
@@ -201,6 +204,7 @@
           </w:tcPr>
           <w:p>
             <w:pPr>
+              <w:keepNext/>
               <w:spacing w:line="240"/>
             </w:pPr>
             <w:r>
@@ -237,6 +241,7 @@
           </w:tcPr>
           <w:p>
             <w:pPr>
+              <w:keepNext/>
               <w:spacing w:line="240"/>
             </w:pPr>
             <w:r>
@@ -267,6 +272,7 @@
           </w:tcPr>
           <w:p>
             <w:pPr>
+              <w:keepNext/>
               <w:spacing w:line="240"/>
             </w:pPr>
             <w:r>
@@ -303,6 +309,7 @@
           </w:tcPr>
           <w:p>
             <w:pPr>
+              <w:keepNext/>
               <w:spacing w:line="240"/>
             </w:pPr>
             <w:r>
@@ -333,6 +340,7 @@
           </w:tcPr>
           <w:p>
             <w:pPr>
+              <w:keepNext/>
               <w:spacing w:line="240"/>
             </w:pPr>
             <w:r>
@@ -369,6 +377,7 @@
           </w:tcPr>
           <w:p>
             <w:pPr>
+              <w:keepNext/>
               <w:spacing w:line="240"/>
             </w:pPr>
             <w:r>
@@ -399,6 +408,7 @@
           </w:tcPr>
           <w:p>
             <w:pPr>
+              <w:keepNext/>
               <w:spacing w:line="240"/>
             </w:pPr>
             <w:r>
@@ -435,6 +445,7 @@
           </w:tcPr>
           <w:p>
             <w:pPr>
+              <w:keepNext/>
               <w:spacing w:line="240"/>
             </w:pPr>
             <w:r>
@@ -465,6 +476,7 @@
           </w:tcPr>
           <w:p>
             <w:pPr>
+              <w:keepNext/>
               <w:spacing w:line="240"/>
             </w:pPr>
             <w:r>
@@ -501,6 +513,7 @@
           </w:tcPr>
           <w:p>
             <w:pPr>
+              <w:keepNext/>
               <w:spacing w:line="240"/>
             </w:pPr>
             <w:r>
@@ -531,6 +544,7 @@
           </w:tcPr>
           <w:p>
             <w:pPr>
+              <w:keepNext/>
               <w:spacing w:line="240"/>
             </w:pPr>
             <w:r>
@@ -567,6 +581,7 @@
           </w:tcPr>
           <w:p>
             <w:pPr>
+              <w:keepNext/>
               <w:spacing w:line="240"/>
             </w:pPr>
             <w:r>
@@ -597,6 +612,7 @@
           </w:tcPr>
           <w:p>
             <w:pPr>
+              <w:keepNext/>
               <w:spacing w:line="240"/>
             </w:pPr>
             <w:r>
@@ -633,6 +649,7 @@
           </w:tcPr>
           <w:p>
             <w:pPr>
+              <w:keepNext/>
               <w:spacing w:line="240"/>
             </w:pPr>
             <w:r>
@@ -663,6 +680,7 @@
           </w:tcPr>
           <w:p>
             <w:pPr>
+              <w:keepNext/>
               <w:spacing w:line="240"/>
             </w:pPr>
             <w:r>
@@ -699,6 +717,7 @@
           </w:tcPr>
           <w:p>
             <w:pPr>
+              <w:keepNext/>
               <w:spacing w:line="240"/>
             </w:pPr>
             <w:r>
@@ -729,6 +748,7 @@
           </w:tcPr>
           <w:p>
             <w:pPr>
+              <w:keepNext/>
               <w:spacing w:line="240"/>
             </w:pPr>
             <w:r>
@@ -806,6 +826,7 @@
           </w:tcPr>
           <w:p>
             <w:pPr>
+              <w:keepNext/>
               <w:spacing w:line="240"/>
             </w:pPr>
             <w:r>
@@ -839,6 +860,7 @@
           </w:tcPr>
           <w:p>
             <w:pPr>
+              <w:keepNext/>
               <w:spacing w:line="240"/>
             </w:pPr>
             <w:r>
@@ -872,6 +894,7 @@
           </w:tcPr>
           <w:p>
             <w:pPr>
+              <w:keepNext/>
               <w:spacing w:line="240"/>
             </w:pPr>
             <w:r>
@@ -910,6 +933,7 @@
           </w:tcPr>
           <w:p>
             <w:pPr>
+              <w:keepNext/>
               <w:spacing w:line="240"/>
             </w:pPr>
             <w:r>
@@ -940,6 +964,7 @@
           </w:tcPr>
           <w:p>
             <w:pPr>
+              <w:keepNext/>
               <w:spacing w:line="240"/>
             </w:pPr>
             <w:r>
@@ -970,6 +995,7 @@
           </w:tcPr>
           <w:p>
             <w:pPr>
+              <w:keepNext/>
               <w:spacing w:line="240"/>
             </w:pPr>
             <w:r>
@@ -1006,6 +1032,7 @@
           </w:tcPr>
           <w:p>
             <w:pPr>
+              <w:keepNext/>
               <w:spacing w:line="240"/>
             </w:pPr>
             <w:r>
@@ -1036,6 +1063,7 @@
           </w:tcPr>
           <w:p>
             <w:pPr>
+              <w:keepNext/>
               <w:spacing w:line="240"/>
             </w:pPr>
             <w:r>
@@ -1066,6 +1094,7 @@
           </w:tcPr>
           <w:p>
             <w:pPr>
+              <w:keepNext/>
               <w:spacing w:line="240"/>
             </w:pPr>
             <w:r>
@@ -1102,6 +1131,7 @@
           </w:tcPr>
           <w:p>
             <w:pPr>
+              <w:keepNext/>
               <w:spacing w:line="240"/>
             </w:pPr>
             <w:r>
@@ -1132,6 +1162,7 @@
           </w:tcPr>
           <w:p>
             <w:pPr>
+              <w:keepNext/>
               <w:spacing w:line="240"/>
             </w:pPr>
             <w:r>
@@ -1162,6 +1193,7 @@
           </w:tcPr>
           <w:p>
             <w:pPr>
+              <w:keepNext/>
               <w:spacing w:line="240"/>
             </w:pPr>
             <w:r>
@@ -1198,6 +1230,7 @@
           </w:tcPr>
           <w:p>
             <w:pPr>
+              <w:keepNext/>
               <w:spacing w:line="240"/>
             </w:pPr>
             <w:r>
@@ -1228,6 +1261,7 @@
           </w:tcPr>
           <w:p>
             <w:pPr>
+              <w:keepNext/>
               <w:spacing w:line="240"/>
             </w:pPr>
             <w:r>
@@ -1258,6 +1292,7 @@
           </w:tcPr>
           <w:p>
             <w:pPr>
+              <w:keepNext/>
               <w:spacing w:line="240"/>
             </w:pPr>
             <w:r>
@@ -1725,6 +1760,7 @@
           </w:tcPr>
           <w:p>
             <w:pPr>
+              <w:keepNext/>
               <w:spacing w:line="240"/>
             </w:pPr>
             <w:r>
@@ -1758,6 +1794,7 @@
           </w:tcPr>
           <w:p>
             <w:pPr>
+              <w:keepNext/>
               <w:spacing w:line="240"/>
             </w:pPr>
             <w:r>
@@ -1796,6 +1833,7 @@
           </w:tcPr>
           <w:p>
             <w:pPr>
+              <w:keepNext/>
               <w:spacing w:line="240"/>
             </w:pPr>
             <w:r>
@@ -1826,6 +1864,7 @@
           </w:tcPr>
           <w:p>
             <w:pPr>
+              <w:keepNext/>
               <w:spacing w:line="240"/>
             </w:pPr>
             <w:r>
@@ -1862,6 +1901,7 @@
           </w:tcPr>
           <w:p>
             <w:pPr>
+              <w:keepNext/>
               <w:spacing w:line="240"/>
             </w:pPr>
             <w:r>
@@ -1892,6 +1932,7 @@
           </w:tcPr>
           <w:p>
             <w:pPr>
+              <w:keepNext/>
               <w:spacing w:line="240"/>
             </w:pPr>
             <w:r>
@@ -1928,6 +1969,7 @@
           </w:tcPr>
           <w:p>
             <w:pPr>
+              <w:keepNext/>
               <w:spacing w:line="240"/>
             </w:pPr>
             <w:r>
@@ -1958,6 +2000,7 @@
           </w:tcPr>
           <w:p>
             <w:pPr>
+              <w:keepNext/>
               <w:spacing w:line="240"/>
             </w:pPr>
             <w:r>
@@ -1994,6 +2037,7 @@
           </w:tcPr>
           <w:p>
             <w:pPr>
+              <w:keepNext/>
               <w:spacing w:line="240"/>
             </w:pPr>
             <w:r>
@@ -2024,6 +2068,7 @@
           </w:tcPr>
           <w:p>
             <w:pPr>
+              <w:keepNext/>
               <w:spacing w:line="240"/>
             </w:pPr>
             <w:r>
@@ -2060,6 +2105,7 @@
           </w:tcPr>
           <w:p>
             <w:pPr>
+              <w:keepNext/>
               <w:spacing w:line="240"/>
             </w:pPr>
             <w:r>
@@ -2090,6 +2136,7 @@
           </w:tcPr>
           <w:p>
             <w:pPr>
+              <w:keepNext/>
               <w:spacing w:line="240"/>
             </w:pPr>
             <w:r>
@@ -2126,6 +2173,7 @@
           </w:tcPr>
           <w:p>
             <w:pPr>
+              <w:keepNext/>
               <w:spacing w:line="240"/>
             </w:pPr>
             <w:r>
@@ -2156,6 +2204,7 @@
           </w:tcPr>
           <w:p>
             <w:pPr>
+              <w:keepNext/>
               <w:spacing w:line="240"/>
             </w:pPr>
             <w:r>
@@ -2192,6 +2241,7 @@
           </w:tcPr>
           <w:p>
             <w:pPr>
+              <w:keepNext/>
               <w:spacing w:line="240"/>
             </w:pPr>
             <w:r>
@@ -2222,6 +2272,7 @@
           </w:tcPr>
           <w:p>
             <w:pPr>
+              <w:keepNext/>
               <w:spacing w:line="240"/>
             </w:pPr>
             <w:r>
@@ -2313,6 +2364,7 @@
           </w:tcPr>
           <w:p>
             <w:pPr>
+              <w:keepNext/>
               <w:spacing w:line="240"/>
             </w:pPr>
             <w:r>
@@ -2346,6 +2398,7 @@
           </w:tcPr>
           <w:p>
             <w:pPr>
+              <w:keepNext/>
               <w:spacing w:line="240"/>
             </w:pPr>
             <w:r>
@@ -2384,6 +2437,7 @@
           </w:tcPr>
           <w:p>
             <w:pPr>
+              <w:keepNext/>
               <w:spacing w:line="240"/>
             </w:pPr>
             <w:r>
@@ -2414,6 +2468,7 @@
           </w:tcPr>
           <w:p>
             <w:pPr>
+              <w:keepNext/>
               <w:spacing w:line="240"/>
             </w:pPr>
             <w:r>
@@ -2450,6 +2505,7 @@
           </w:tcPr>
           <w:p>
             <w:pPr>
+              <w:keepNext/>
               <w:spacing w:line="240"/>
             </w:pPr>
             <w:r>
@@ -2480,6 +2536,7 @@
           </w:tcPr>
           <w:p>
             <w:pPr>
+              <w:keepNext/>
               <w:spacing w:line="240"/>
             </w:pPr>
             <w:r>
@@ -2516,6 +2573,7 @@
           </w:tcPr>
           <w:p>
             <w:pPr>
+              <w:keepNext/>
               <w:spacing w:line="240"/>
             </w:pPr>
             <w:r>
@@ -2546,6 +2604,7 @@
           </w:tcPr>
           <w:p>
             <w:pPr>
+              <w:keepNext/>
               <w:spacing w:line="240"/>
             </w:pPr>
             <w:r>
@@ -2582,6 +2641,7 @@
           </w:tcPr>
           <w:p>
             <w:pPr>
+              <w:keepNext/>
               <w:spacing w:line="240"/>
             </w:pPr>
             <w:r>
@@ -2612,6 +2672,7 @@
           </w:tcPr>
           <w:p>
             <w:pPr>
+              <w:keepNext/>
               <w:spacing w:line="240"/>
             </w:pPr>
             <w:r>
@@ -2648,6 +2709,7 @@
           </w:tcPr>
           <w:p>
             <w:pPr>
+              <w:keepNext/>
               <w:spacing w:line="240"/>
             </w:pPr>
             <w:r>
@@ -2678,6 +2740,7 @@
           </w:tcPr>
           <w:p>
             <w:pPr>
+              <w:keepNext/>
               <w:spacing w:line="240"/>
             </w:pPr>
             <w:r>
@@ -2785,8 +2848,91 @@
       <w:r>
         <w:rPr>
           <w:rFonts w:ascii="Times New Roman" w:cs="Times New Roman" w:eastAsia="Times New Roman" w:hAnsi="Times New Roman"/>
-        </w:rPr>
-        <w:t xml:space="preserve">Disposição final em aterro próprio ou de terceiro licenciado. O aterro não é bem reversível e, ao fim do contrato, deve ter vida útil remanescente de pelo menos 5 anos.</w:t>
+          <w:b/>
+          <w:bCs/>
+        </w:rPr>
+        <w:t xml:space="preserve">Disposição final:</w:t>
+      </w:r>
+      <w:r>
+        <w:rPr>
+          <w:rFonts w:ascii="Times New Roman" w:cs="Times New Roman" w:eastAsia="Times New Roman" w:hAnsi="Times New Roman"/>
+        </w:rPr>
+        <w:t xml:space="preserve"> em aterro próprio ou de terceiro licenciado, isoladamente ou em sequência (Contrato, 15.1).</w:t>
+      </w:r>
+    </w:p>
+    <w:p>
+      <w:pPr>
+        <w:pStyle w:val="ListParagraph"/>
+        <w:numPr>
+          <w:ilvl w:val="0"/>
+          <w:numId w:val="2"/>
+        </w:numPr>
+        <w:spacing w:after="60" w:line="360"/>
+        <w:jc w:val="both"/>
+      </w:pPr>
+      <w:r>
+        <w:rPr>
+          <w:rFonts w:ascii="Times New Roman" w:cs="Times New Roman" w:eastAsia="Times New Roman" w:hAnsi="Times New Roman"/>
+          <w:b/>
+          <w:bCs/>
+        </w:rPr>
+        <w:t xml:space="preserve">Prazo do aterro:</w:t>
+      </w:r>
+      <w:r>
+        <w:rPr>
+          <w:rFonts w:ascii="Times New Roman" w:cs="Times New Roman" w:eastAsia="Times New Roman" w:hAnsi="Times New Roman"/>
+        </w:rPr>
+        <w:t xml:space="preserve"> até a Ordem de Serviço, que ocorre no máximo 180 dias após a assinatura, o aterro indicado, próprio ou de terceiro, deve estar implantado, em operação, licenciado e com vida útil de pelo menos 12 meses (Contrato, 5.4). Logo após a Ordem de Serviço, deve haver ao menos uma solução de disposição final disponível (Caderno de Encargos, Tabela 7).</w:t>
+      </w:r>
+    </w:p>
+    <w:p>
+      <w:pPr>
+        <w:pStyle w:val="ListParagraph"/>
+        <w:numPr>
+          <w:ilvl w:val="0"/>
+          <w:numId w:val="2"/>
+        </w:numPr>
+        <w:spacing w:after="60" w:line="360"/>
+        <w:jc w:val="both"/>
+      </w:pPr>
+      <w:r>
+        <w:rPr>
+          <w:rFonts w:ascii="Times New Roman" w:cs="Times New Roman" w:eastAsia="Times New Roman" w:hAnsi="Times New Roman"/>
+          <w:b/>
+          <w:bCs/>
+        </w:rPr>
+        <w:t xml:space="preserve">Aterro próprio:</w:t>
+      </w:r>
+      <w:r>
+        <w:rPr>
+          <w:rFonts w:ascii="Times New Roman" w:cs="Times New Roman" w:eastAsia="Times New Roman" w:hAnsi="Times New Roman"/>
+        </w:rPr>
+        <w:t xml:space="preserve"> o licenciamento, o projeto, a compra da área e a implantação começam logo após a assinatura (Contrato, 15.1.1). O contrato remete os prazos de projeto e obra ao cronograma do Caderno de Encargos, que não traz prazo específico para o aterro próprio. No modelo de referência, a disposição é feita em aterros privados nos anos 1 a 4, o aterro próprio é implantado nos anos 2 a 4 e opera a partir do ano 5.</w:t>
+      </w:r>
+    </w:p>
+    <w:p>
+      <w:pPr>
+        <w:pStyle w:val="ListParagraph"/>
+        <w:numPr>
+          <w:ilvl w:val="0"/>
+          <w:numId w:val="2"/>
+        </w:numPr>
+        <w:spacing w:after="60" w:line="360"/>
+        <w:jc w:val="both"/>
+      </w:pPr>
+      <w:r>
+        <w:rPr>
+          <w:rFonts w:ascii="Times New Roman" w:cs="Times New Roman" w:eastAsia="Times New Roman" w:hAnsi="Times New Roman"/>
+          <w:b/>
+          <w:bCs/>
+        </w:rPr>
+        <w:t xml:space="preserve">Fim do contrato:</w:t>
+      </w:r>
+      <w:r>
+        <w:rPr>
+          <w:rFonts w:ascii="Times New Roman" w:cs="Times New Roman" w:eastAsia="Times New Roman" w:hAnsi="Times New Roman"/>
+        </w:rPr>
+        <w:t xml:space="preserve"> o aterro não é bem reversível e, ao término, deve estar licenciado e ter vida útil remanescente de pelo menos 5 anos (Contrato, 15.7).</w:t>
       </w:r>
     </w:p>
     <w:p>
@@ -2895,6 +3041,7 @@
           </w:tcPr>
           <w:p>
             <w:pPr>
+              <w:keepNext/>
               <w:spacing w:line="240"/>
             </w:pPr>
             <w:r>
@@ -2928,6 +3075,7 @@
           </w:tcPr>
           <w:p>
             <w:pPr>
+              <w:keepNext/>
               <w:spacing w:line="240"/>
             </w:pPr>
             <w:r>
@@ -2961,6 +3109,7 @@
           </w:tcPr>
           <w:p>
             <w:pPr>
+              <w:keepNext/>
               <w:spacing w:line="240"/>
             </w:pPr>
             <w:r>
@@ -2994,6 +3143,7 @@
           </w:tcPr>
           <w:p>
             <w:pPr>
+              <w:keepNext/>
               <w:spacing w:line="240"/>
             </w:pPr>
             <w:r>
@@ -3027,6 +3177,7 @@
           </w:tcPr>
           <w:p>
             <w:pPr>
+              <w:keepNext/>
               <w:spacing w:line="240"/>
             </w:pPr>
             <w:r>
@@ -3065,6 +3216,7 @@
           </w:tcPr>
           <w:p>
             <w:pPr>
+              <w:keepNext/>
               <w:spacing w:line="240"/>
             </w:pPr>
             <w:r>
@@ -3095,6 +3247,7 @@
           </w:tcPr>
           <w:p>
             <w:pPr>
+              <w:keepNext/>
               <w:spacing w:line="240"/>
             </w:pPr>
             <w:r>
@@ -3125,6 +3278,7 @@
           </w:tcPr>
           <w:p>
             <w:pPr>
+              <w:keepNext/>
               <w:spacing w:line="240"/>
             </w:pPr>
             <w:r>
@@ -3155,6 +3309,7 @@
           </w:tcPr>
           <w:p>
             <w:pPr>
+              <w:keepNext/>
               <w:spacing w:line="240"/>
             </w:pPr>
             <w:r>
@@ -3185,6 +3340,7 @@
           </w:tcPr>
           <w:p>
             <w:pPr>
+              <w:keepNext/>
               <w:spacing w:line="240"/>
             </w:pPr>
             <w:r>
@@ -3221,6 +3377,7 @@
           </w:tcPr>
           <w:p>
             <w:pPr>
+              <w:keepNext/>
               <w:spacing w:line="240"/>
             </w:pPr>
             <w:r>
@@ -3251,6 +3408,7 @@
           </w:tcPr>
           <w:p>
             <w:pPr>
+              <w:keepNext/>
               <w:spacing w:line="240"/>
             </w:pPr>
             <w:r>
@@ -3281,6 +3439,7 @@
           </w:tcPr>
           <w:p>
             <w:pPr>
+              <w:keepNext/>
               <w:spacing w:line="240"/>
             </w:pPr>
             <w:r>
@@ -3311,6 +3470,7 @@
           </w:tcPr>
           <w:p>
             <w:pPr>
+              <w:keepNext/>
               <w:spacing w:line="240"/>
             </w:pPr>
             <w:r>
@@ -3341,6 +3501,7 @@
           </w:tcPr>
           <w:p>
             <w:pPr>
+              <w:keepNext/>
               <w:spacing w:line="240"/>
             </w:pPr>
             <w:r>
@@ -3377,6 +3538,7 @@
           </w:tcPr>
           <w:p>
             <w:pPr>
+              <w:keepNext/>
               <w:spacing w:line="240"/>
             </w:pPr>
             <w:r>
@@ -3407,6 +3569,7 @@
           </w:tcPr>
           <w:p>
             <w:pPr>
+              <w:keepNext/>
               <w:spacing w:line="240"/>
             </w:pPr>
             <w:r>
@@ -3437,6 +3600,7 @@
           </w:tcPr>
           <w:p>
             <w:pPr>
+              <w:keepNext/>
               <w:spacing w:line="240"/>
             </w:pPr>
             <w:r>
@@ -3467,6 +3631,7 @@
           </w:tcPr>
           <w:p>
             <w:pPr>
+              <w:keepNext/>
               <w:spacing w:line="240"/>
             </w:pPr>
             <w:r>
@@ -3497,6 +3662,7 @@
           </w:tcPr>
           <w:p>
             <w:pPr>
+              <w:keepNext/>
               <w:spacing w:line="240"/>
             </w:pPr>
             <w:r>
@@ -3803,6 +3969,7 @@
           </w:tcPr>
           <w:p>
             <w:pPr>
+              <w:keepNext/>
               <w:spacing w:line="240"/>
             </w:pPr>
             <w:r>
@@ -3836,6 +4003,7 @@
           </w:tcPr>
           <w:p>
             <w:pPr>
+              <w:keepNext/>
               <w:spacing w:line="240"/>
             </w:pPr>
             <w:r>
@@ -3869,6 +4037,7 @@
           </w:tcPr>
           <w:p>
             <w:pPr>
+              <w:keepNext/>
               <w:spacing w:line="240"/>
             </w:pPr>
             <w:r>
@@ -3907,6 +4076,7 @@
           </w:tcPr>
           <w:p>
             <w:pPr>
+              <w:keepNext/>
               <w:spacing w:line="240"/>
             </w:pPr>
             <w:r>
@@ -3937,6 +4107,7 @@
           </w:tcPr>
           <w:p>
             <w:pPr>
+              <w:keepNext/>
               <w:spacing w:line="240"/>
             </w:pPr>
             <w:r>
@@ -3967,6 +4138,7 @@
           </w:tcPr>
           <w:p>
             <w:pPr>
+              <w:keepNext/>
               <w:spacing w:line="240"/>
             </w:pPr>
             <w:r>
@@ -4003,6 +4175,7 @@
           </w:tcPr>
           <w:p>
             <w:pPr>
+              <w:keepNext/>
               <w:spacing w:line="240"/>
             </w:pPr>
             <w:r>
@@ -4033,6 +4206,7 @@
           </w:tcPr>
           <w:p>
             <w:pPr>
+              <w:keepNext/>
               <w:spacing w:line="240"/>
             </w:pPr>
             <w:r>
@@ -4063,6 +4237,7 @@
           </w:tcPr>
           <w:p>
             <w:pPr>
+              <w:keepNext/>
               <w:spacing w:line="240"/>
             </w:pPr>
             <w:r>
@@ -4099,6 +4274,7 @@
           </w:tcPr>
           <w:p>
             <w:pPr>
+              <w:keepNext/>
               <w:spacing w:line="240"/>
             </w:pPr>
             <w:r>
@@ -4129,6 +4305,7 @@
           </w:tcPr>
           <w:p>
             <w:pPr>
+              <w:keepNext/>
               <w:spacing w:line="240"/>
             </w:pPr>
             <w:r>
@@ -4159,6 +4336,7 @@
           </w:tcPr>
           <w:p>
             <w:pPr>
+              <w:keepNext/>
               <w:spacing w:line="240"/>
             </w:pPr>
             <w:r>
@@ -4195,6 +4373,7 @@
           </w:tcPr>
           <w:p>
             <w:pPr>
+              <w:keepNext/>
               <w:spacing w:line="240"/>
             </w:pPr>
             <w:r>
@@ -4225,6 +4404,7 @@
           </w:tcPr>
           <w:p>
             <w:pPr>
+              <w:keepNext/>
               <w:spacing w:line="240"/>
             </w:pPr>
             <w:r>
@@ -4255,6 +4435,7 @@
           </w:tcPr>
           <w:p>
             <w:pPr>
+              <w:keepNext/>
               <w:spacing w:line="240"/>
             </w:pPr>
             <w:r>
@@ -4371,6 +4552,7 @@
           </w:tcPr>
           <w:p>
             <w:pPr>
+              <w:keepNext/>
               <w:spacing w:line="240"/>
             </w:pPr>
             <w:r>
@@ -4404,6 +4586,7 @@
           </w:tcPr>
           <w:p>
             <w:pPr>
+              <w:keepNext/>
               <w:spacing w:line="240"/>
             </w:pPr>
             <w:r>
@@ -4442,6 +4625,7 @@
           </w:tcPr>
           <w:p>
             <w:pPr>
+              <w:keepNext/>
               <w:spacing w:line="240"/>
             </w:pPr>
             <w:r>
@@ -4472,6 +4656,7 @@
           </w:tcPr>
           <w:p>
             <w:pPr>
+              <w:keepNext/>
               <w:spacing w:line="240"/>
             </w:pPr>
             <w:r>
@@ -4508,6 +4693,7 @@
           </w:tcPr>
           <w:p>
             <w:pPr>
+              <w:keepNext/>
               <w:spacing w:line="240"/>
             </w:pPr>
             <w:r>
@@ -4538,6 +4724,7 @@
           </w:tcPr>
           <w:p>
             <w:pPr>
+              <w:keepNext/>
               <w:spacing w:line="240"/>
             </w:pPr>
             <w:r>
@@ -4574,6 +4761,7 @@
           </w:tcPr>
           <w:p>
             <w:pPr>
+              <w:keepNext/>
               <w:spacing w:line="240"/>
             </w:pPr>
             <w:r>
@@ -4604,6 +4792,7 @@
           </w:tcPr>
           <w:p>
             <w:pPr>
+              <w:keepNext/>
               <w:spacing w:line="240"/>
             </w:pPr>
             <w:r>
@@ -4640,6 +4829,7 @@
           </w:tcPr>
           <w:p>
             <w:pPr>
+              <w:keepNext/>
               <w:spacing w:line="240"/>
             </w:pPr>
             <w:r>
@@ -4670,6 +4860,7 @@
           </w:tcPr>
           <w:p>
             <w:pPr>
+              <w:keepNext/>
               <w:spacing w:line="240"/>
             </w:pPr>
             <w:r>
@@ -4706,6 +4897,7 @@
           </w:tcPr>
           <w:p>
             <w:pPr>
+              <w:keepNext/>
               <w:spacing w:line="240"/>
             </w:pPr>
             <w:r>
@@ -4736,6 +4928,7 @@
           </w:tcPr>
           <w:p>
             <w:pPr>
+              <w:keepNext/>
               <w:spacing w:line="240"/>
             </w:pPr>
             <w:r>
@@ -4772,6 +4965,7 @@
           </w:tcPr>
           <w:p>
             <w:pPr>
+              <w:keepNext/>
               <w:spacing w:line="240"/>
             </w:pPr>
             <w:r>
@@ -4802,6 +4996,7 @@
           </w:tcPr>
           <w:p>
             <w:pPr>
+              <w:keepNext/>
               <w:spacing w:line="240"/>
             </w:pPr>
             <w:r>

</xml_diff>